<commit_message>
Tuần 06, bài 4
</commit_message>
<xml_diff>
--- a/NguyenVanAnhDuc_Tuan06/Bài tập thực hành tuần 6.docx
+++ b/NguyenVanAnhDuc_Tuan06/Bài tập thực hành tuần 6.docx
@@ -44,6 +44,56 @@
           <w:lang w:val="vi-VN"/>
         </w:rPr>
         <w:t xml:space="preserve">Github: </w:t>
+      </w:r>
+      <w:r>
+        <w:rPr>
+          <w:lang w:val="vi-VN"/>
+        </w:rPr>
+        <w:fldChar w:fldCharType="begin"/>
+      </w:r>
+      <w:r>
+        <w:rPr>
+          <w:lang w:val="vi-VN"/>
+        </w:rPr>
+        <w:instrText xml:space="preserve"> HYPERLINK "https://github.com/dickese/Mobile/tree/main/NguyenVanAnhDuc_Tuan06/Lab06" </w:instrText>
+      </w:r>
+      <w:r>
+        <w:rPr>
+          <w:lang w:val="vi-VN"/>
+        </w:rPr>
+      </w:r>
+      <w:r>
+        <w:rPr>
+          <w:lang w:val="vi-VN"/>
+        </w:rPr>
+        <w:fldChar w:fldCharType="separate"/>
+      </w:r>
+      <w:r>
+        <w:rPr>
+          <w:rStyle w:val="Hyperlink"/>
+          <w:lang w:val="vi-VN"/>
+        </w:rPr>
+        <w:t>https://github.com/dickese/Mobile/tree/main/NguyenV</w:t>
+      </w:r>
+      <w:r>
+        <w:rPr>
+          <w:rStyle w:val="Hyperlink"/>
+          <w:lang w:val="vi-VN"/>
+        </w:rPr>
+        <w:t>a</w:t>
+      </w:r>
+      <w:r>
+        <w:rPr>
+          <w:rStyle w:val="Hyperlink"/>
+          <w:lang w:val="vi-VN"/>
+        </w:rPr>
+        <w:t>nAnhDuc_Tuan06/Lab06</w:t>
+      </w:r>
+      <w:r>
+        <w:rPr>
+          <w:lang w:val="vi-VN"/>
+        </w:rPr>
+        <w:fldChar w:fldCharType="end"/>
       </w:r>
     </w:p>
     <w:p>
@@ -495,8 +545,621 @@
           <w:lang w:val="vi-VN"/>
         </w:rPr>
       </w:pPr>
+    </w:p>
+    <w:p>
+      <w:pPr>
+        <w:spacing w:after="100" w:line="276" w:lineRule="auto"/>
+      </w:pPr>
+      <w:r>
+        <w:t>A</w:t>
+      </w:r>
+      <w:r>
+        <w:t xml:space="preserve">pp </w:t>
+      </w:r>
+      <w:proofErr w:type="spellStart"/>
+      <w:r>
+        <w:t>có</w:t>
+      </w:r>
+      <w:proofErr w:type="spellEnd"/>
+      <w:r>
+        <w:t xml:space="preserve"> Bottom Tab </w:t>
+      </w:r>
+      <w:proofErr w:type="spellStart"/>
+      <w:r>
+        <w:t>với</w:t>
+      </w:r>
+      <w:proofErr w:type="spellEnd"/>
+      <w:r>
+        <w:t xml:space="preserve"> 3 </w:t>
+      </w:r>
+      <w:proofErr w:type="spellStart"/>
+      <w:r>
+        <w:t>màn</w:t>
+      </w:r>
+      <w:proofErr w:type="spellEnd"/>
+      <w:r>
+        <w:t xml:space="preserve">: </w:t>
+      </w:r>
+    </w:p>
+    <w:p>
+      <w:pPr>
+        <w:spacing w:after="100" w:line="276" w:lineRule="auto"/>
+        <w:rPr>
+          <w:lang w:val="vi-VN"/>
+        </w:rPr>
+      </w:pPr>
+      <w:r>
+        <w:rPr>
+          <w:b/>
+          <w:bCs/>
+        </w:rPr>
+        <w:t>Home</w:t>
+      </w:r>
+      <w:r>
+        <w:t xml:space="preserve"> (</w:t>
+      </w:r>
+      <w:proofErr w:type="spellStart"/>
+      <w:r>
+        <w:t>FlatList</w:t>
+      </w:r>
+      <w:proofErr w:type="spellEnd"/>
+      <w:r>
+        <w:t xml:space="preserve"> </w:t>
+      </w:r>
+      <w:proofErr w:type="spellStart"/>
+      <w:r>
+        <w:t>đơn</w:t>
+      </w:r>
+      <w:proofErr w:type="spellEnd"/>
+      <w:r>
+        <w:t xml:space="preserve"> </w:t>
+      </w:r>
+      <w:proofErr w:type="spellStart"/>
+      <w:r>
+        <w:t>giản</w:t>
+      </w:r>
+      <w:proofErr w:type="spellEnd"/>
+      <w:r>
+        <w:t>)</w:t>
+      </w:r>
+      <w:r>
+        <w:rPr>
+          <w:lang w:val="vi-VN"/>
+        </w:rPr>
+        <w:t xml:space="preserve"> Hiển thị thông tin các sản phẩm</w:t>
+      </w:r>
+    </w:p>
+    <w:p>
+      <w:pPr>
+        <w:spacing w:after="100" w:line="276" w:lineRule="auto"/>
+      </w:pPr>
+      <w:r>
+        <w:drawing>
+          <wp:inline distT="0" distB="0" distL="0" distR="0" wp14:anchorId="63704B3B" wp14:editId="5535254E">
+            <wp:extent cx="5943600" cy="3131185"/>
+            <wp:effectExtent l="0" t="0" r="0" b="0"/>
+            <wp:docPr id="7" name="Picture 7"/>
+            <wp:cNvGraphicFramePr>
+              <a:graphicFrameLocks xmlns:a="http://schemas.openxmlformats.org/drawingml/2006/main" noChangeAspect="1"/>
+            </wp:cNvGraphicFramePr>
+            <a:graphic xmlns:a="http://schemas.openxmlformats.org/drawingml/2006/main">
+              <a:graphicData uri="http://schemas.openxmlformats.org/drawingml/2006/picture">
+                <pic:pic xmlns:pic="http://schemas.openxmlformats.org/drawingml/2006/picture">
+                  <pic:nvPicPr>
+                    <pic:cNvPr id="1" name=""/>
+                    <pic:cNvPicPr/>
+                  </pic:nvPicPr>
+                  <pic:blipFill>
+                    <a:blip r:embed="rId10"/>
+                    <a:stretch>
+                      <a:fillRect/>
+                    </a:stretch>
+                  </pic:blipFill>
+                  <pic:spPr>
+                    <a:xfrm>
+                      <a:off x="0" y="0"/>
+                      <a:ext cx="5943600" cy="3131185"/>
+                    </a:xfrm>
+                    <a:prstGeom prst="rect">
+                      <a:avLst/>
+                    </a:prstGeom>
+                  </pic:spPr>
+                </pic:pic>
+              </a:graphicData>
+            </a:graphic>
+          </wp:inline>
+        </w:drawing>
+      </w:r>
+    </w:p>
+    <w:p>
+      <w:pPr>
+        <w:spacing w:after="100" w:line="276" w:lineRule="auto"/>
+        <w:rPr>
+          <w:lang w:val="vi-VN"/>
+        </w:rPr>
+      </w:pPr>
+      <w:r>
+        <w:t xml:space="preserve"> </w:t>
+      </w:r>
+      <w:r>
+        <w:rPr>
+          <w:b/>
+          <w:bCs/>
+        </w:rPr>
+        <w:t>Search</w:t>
+      </w:r>
+      <w:r>
+        <w:t xml:space="preserve"> (</w:t>
+      </w:r>
+      <w:proofErr w:type="spellStart"/>
+      <w:r>
+        <w:t>có</w:t>
+      </w:r>
+      <w:proofErr w:type="spellEnd"/>
+      <w:r>
+        <w:t xml:space="preserve"> </w:t>
+      </w:r>
+      <w:proofErr w:type="spellStart"/>
+      <w:r>
+        <w:t>TextInput</w:t>
+      </w:r>
+      <w:proofErr w:type="spellEnd"/>
+      <w:r>
+        <w:t xml:space="preserve"> </w:t>
+      </w:r>
+      <w:proofErr w:type="spellStart"/>
+      <w:r>
+        <w:t>nhập</w:t>
+      </w:r>
+      <w:proofErr w:type="spellEnd"/>
+      <w:r>
+        <w:t xml:space="preserve"> </w:t>
+      </w:r>
+      <w:proofErr w:type="spellStart"/>
+      <w:r>
+        <w:t>từ</w:t>
+      </w:r>
+      <w:proofErr w:type="spellEnd"/>
+      <w:r>
+        <w:t xml:space="preserve"> </w:t>
+      </w:r>
+      <w:proofErr w:type="spellStart"/>
+      <w:r>
+        <w:t>khóa</w:t>
+      </w:r>
+      <w:proofErr w:type="spellEnd"/>
+      <w:r>
+        <w:t xml:space="preserve">), </w:t>
+      </w:r>
+      <w:r>
+        <w:t>Cho</w:t>
+      </w:r>
+      <w:r>
+        <w:rPr>
+          <w:lang w:val="vi-VN"/>
+        </w:rPr>
+        <w:t xml:space="preserve"> phép tìm kiếm sản phẩm theo từ khóa</w:t>
+      </w:r>
+    </w:p>
+    <w:p>
+      <w:pPr>
+        <w:spacing w:after="100" w:line="276" w:lineRule="auto"/>
+        <w:rPr>
+          <w:b/>
+          <w:bCs/>
+        </w:rPr>
+      </w:pPr>
+      <w:r>
+        <w:rPr>
+          <w:b/>
+          <w:bCs/>
+        </w:rPr>
+        <w:drawing>
+          <wp:inline distT="0" distB="0" distL="0" distR="0" wp14:anchorId="2208CB01" wp14:editId="6B85AAEF">
+            <wp:extent cx="5943600" cy="3076575"/>
+            <wp:effectExtent l="0" t="0" r="0" b="9525"/>
+            <wp:docPr id="8" name="Picture 8"/>
+            <wp:cNvGraphicFramePr>
+              <a:graphicFrameLocks xmlns:a="http://schemas.openxmlformats.org/drawingml/2006/main" noChangeAspect="1"/>
+            </wp:cNvGraphicFramePr>
+            <a:graphic xmlns:a="http://schemas.openxmlformats.org/drawingml/2006/main">
+              <a:graphicData uri="http://schemas.openxmlformats.org/drawingml/2006/picture">
+                <pic:pic xmlns:pic="http://schemas.openxmlformats.org/drawingml/2006/picture">
+                  <pic:nvPicPr>
+                    <pic:cNvPr id="1" name=""/>
+                    <pic:cNvPicPr/>
+                  </pic:nvPicPr>
+                  <pic:blipFill>
+                    <a:blip r:embed="rId11"/>
+                    <a:stretch>
+                      <a:fillRect/>
+                    </a:stretch>
+                  </pic:blipFill>
+                  <pic:spPr>
+                    <a:xfrm>
+                      <a:off x="0" y="0"/>
+                      <a:ext cx="5943600" cy="3076575"/>
+                    </a:xfrm>
+                    <a:prstGeom prst="rect">
+                      <a:avLst/>
+                    </a:prstGeom>
+                  </pic:spPr>
+                </pic:pic>
+              </a:graphicData>
+            </a:graphic>
+          </wp:inline>
+        </w:drawing>
+      </w:r>
+    </w:p>
+    <w:p>
+      <w:pPr>
+        <w:spacing w:after="100" w:line="276" w:lineRule="auto"/>
+      </w:pPr>
+      <w:r>
+        <w:rPr>
+          <w:b/>
+          <w:bCs/>
+        </w:rPr>
+        <w:t>Profile</w:t>
+      </w:r>
+      <w:r>
+        <w:t xml:space="preserve"> (Avatar + Name). </w:t>
+      </w:r>
+      <w:proofErr w:type="spellStart"/>
+      <w:r>
+        <w:t>Mỗi</w:t>
+      </w:r>
+      <w:proofErr w:type="spellEnd"/>
+      <w:r>
+        <w:t xml:space="preserve"> tab </w:t>
+      </w:r>
+      <w:proofErr w:type="spellStart"/>
+      <w:r>
+        <w:t>có</w:t>
+      </w:r>
+      <w:proofErr w:type="spellEnd"/>
+      <w:r>
+        <w:t xml:space="preserve"> icon (</w:t>
+      </w:r>
+      <w:proofErr w:type="spellStart"/>
+      <w:r>
+        <w:t>Ionicons</w:t>
+      </w:r>
+      <w:proofErr w:type="spellEnd"/>
+      <w:r>
+        <w:t>).</w:t>
+      </w:r>
+    </w:p>
+    <w:p>
+      <w:pPr>
+        <w:spacing w:after="100" w:line="276" w:lineRule="auto"/>
+      </w:pPr>
+      <w:r>
+        <w:lastRenderedPageBreak/>
+        <w:drawing>
+          <wp:inline distT="0" distB="0" distL="0" distR="0" wp14:anchorId="111FF2ED" wp14:editId="4E60DB5A">
+            <wp:extent cx="5943600" cy="3125470"/>
+            <wp:effectExtent l="0" t="0" r="0" b="0"/>
+            <wp:docPr id="9" name="Picture 9"/>
+            <wp:cNvGraphicFramePr>
+              <a:graphicFrameLocks xmlns:a="http://schemas.openxmlformats.org/drawingml/2006/main" noChangeAspect="1"/>
+            </wp:cNvGraphicFramePr>
+            <a:graphic xmlns:a="http://schemas.openxmlformats.org/drawingml/2006/main">
+              <a:graphicData uri="http://schemas.openxmlformats.org/drawingml/2006/picture">
+                <pic:pic xmlns:pic="http://schemas.openxmlformats.org/drawingml/2006/picture">
+                  <pic:nvPicPr>
+                    <pic:cNvPr id="1" name=""/>
+                    <pic:cNvPicPr/>
+                  </pic:nvPicPr>
+                  <pic:blipFill>
+                    <a:blip r:embed="rId12"/>
+                    <a:stretch>
+                      <a:fillRect/>
+                    </a:stretch>
+                  </pic:blipFill>
+                  <pic:spPr>
+                    <a:xfrm>
+                      <a:off x="0" y="0"/>
+                      <a:ext cx="5943600" cy="3125470"/>
+                    </a:xfrm>
+                    <a:prstGeom prst="rect">
+                      <a:avLst/>
+                    </a:prstGeom>
+                  </pic:spPr>
+                </pic:pic>
+              </a:graphicData>
+            </a:graphic>
+          </wp:inline>
+        </w:drawing>
+      </w:r>
+    </w:p>
+    <w:p>
+      <w:pPr>
+        <w:spacing w:after="100" w:line="276" w:lineRule="auto"/>
+      </w:pPr>
+    </w:p>
+    <w:p>
+      <w:pPr>
+        <w:spacing w:after="100" w:line="276" w:lineRule="auto"/>
+        <w:rPr>
+          <w:lang w:val="vi-VN"/>
+        </w:rPr>
+      </w:pPr>
+      <w:r>
+        <w:rPr>
+          <w:lang w:val="vi-VN"/>
+        </w:rPr>
+        <w:t>Bài 4:</w:t>
+      </w:r>
+    </w:p>
+    <w:p>
+      <w:pPr>
+        <w:spacing w:after="100" w:line="276" w:lineRule="auto"/>
+        <w:rPr>
+          <w:lang w:val="vi-VN"/>
+        </w:rPr>
+      </w:pPr>
+      <w:r>
+        <w:rPr>
+          <w:lang w:val="vi-VN"/>
+        </w:rPr>
+        <w:t xml:space="preserve">Trên trang Home chia làm 2 </w:t>
+      </w:r>
+      <w:r>
+        <w:rPr>
+          <w:lang w:val="vi-VN"/>
+        </w:rPr>
+        <w:t>tab: Sản phẩm và Yêu thích</w:t>
+      </w:r>
+    </w:p>
+    <w:p>
+      <w:pPr>
+        <w:spacing w:after="100" w:line="276" w:lineRule="auto"/>
+        <w:rPr>
+          <w:lang w:val="vi-VN"/>
+        </w:rPr>
+      </w:pPr>
+      <w:r>
+        <w:rPr>
+          <w:lang w:val="vi-VN"/>
+        </w:rPr>
+        <w:drawing>
+          <wp:inline distT="0" distB="0" distL="0" distR="0" wp14:anchorId="380DDB56" wp14:editId="15F9F0D7">
+            <wp:extent cx="5943600" cy="3246120"/>
+            <wp:effectExtent l="0" t="0" r="0" b="0"/>
+            <wp:docPr id="10" name="Picture 10"/>
+            <wp:cNvGraphicFramePr>
+              <a:graphicFrameLocks xmlns:a="http://schemas.openxmlformats.org/drawingml/2006/main" noChangeAspect="1"/>
+            </wp:cNvGraphicFramePr>
+            <a:graphic xmlns:a="http://schemas.openxmlformats.org/drawingml/2006/main">
+              <a:graphicData uri="http://schemas.openxmlformats.org/drawingml/2006/picture">
+                <pic:pic xmlns:pic="http://schemas.openxmlformats.org/drawingml/2006/picture">
+                  <pic:nvPicPr>
+                    <pic:cNvPr id="1" name=""/>
+                    <pic:cNvPicPr/>
+                  </pic:nvPicPr>
+                  <pic:blipFill>
+                    <a:blip r:embed="rId13"/>
+                    <a:stretch>
+                      <a:fillRect/>
+                    </a:stretch>
+                  </pic:blipFill>
+                  <pic:spPr>
+                    <a:xfrm>
+                      <a:off x="0" y="0"/>
+                      <a:ext cx="5943600" cy="3246120"/>
+                    </a:xfrm>
+                    <a:prstGeom prst="rect">
+                      <a:avLst/>
+                    </a:prstGeom>
+                  </pic:spPr>
+                </pic:pic>
+              </a:graphicData>
+            </a:graphic>
+          </wp:inline>
+        </w:drawing>
+      </w:r>
+    </w:p>
+    <w:p>
+      <w:pPr>
+        <w:spacing w:after="100" w:line="276" w:lineRule="auto"/>
+        <w:rPr>
+          <w:lang w:val="vi-VN"/>
+        </w:rPr>
+      </w:pPr>
+    </w:p>
+    <w:p>
+      <w:pPr>
+        <w:spacing w:after="100" w:line="276" w:lineRule="auto"/>
+        <w:rPr>
+          <w:lang w:val="vi-VN"/>
+        </w:rPr>
+      </w:pPr>
+      <w:r>
+        <w:rPr>
+          <w:lang w:val="vi-VN"/>
+        </w:rPr>
+        <w:lastRenderedPageBreak/>
+        <w:drawing>
+          <wp:inline distT="0" distB="0" distL="0" distR="0" wp14:anchorId="4785987F" wp14:editId="64770A02">
+            <wp:extent cx="5943600" cy="3105150"/>
+            <wp:effectExtent l="0" t="0" r="0" b="0"/>
+            <wp:docPr id="11" name="Picture 11"/>
+            <wp:cNvGraphicFramePr>
+              <a:graphicFrameLocks xmlns:a="http://schemas.openxmlformats.org/drawingml/2006/main" noChangeAspect="1"/>
+            </wp:cNvGraphicFramePr>
+            <a:graphic xmlns:a="http://schemas.openxmlformats.org/drawingml/2006/main">
+              <a:graphicData uri="http://schemas.openxmlformats.org/drawingml/2006/picture">
+                <pic:pic xmlns:pic="http://schemas.openxmlformats.org/drawingml/2006/picture">
+                  <pic:nvPicPr>
+                    <pic:cNvPr id="1" name=""/>
+                    <pic:cNvPicPr/>
+                  </pic:nvPicPr>
+                  <pic:blipFill>
+                    <a:blip r:embed="rId14"/>
+                    <a:stretch>
+                      <a:fillRect/>
+                    </a:stretch>
+                  </pic:blipFill>
+                  <pic:spPr>
+                    <a:xfrm>
+                      <a:off x="0" y="0"/>
+                      <a:ext cx="5943600" cy="3105150"/>
+                    </a:xfrm>
+                    <a:prstGeom prst="rect">
+                      <a:avLst/>
+                    </a:prstGeom>
+                  </pic:spPr>
+                </pic:pic>
+              </a:graphicData>
+            </a:graphic>
+          </wp:inline>
+        </w:drawing>
+      </w:r>
+    </w:p>
+    <w:p>
+      <w:pPr>
+        <w:rPr>
+          <w:lang w:val="vi-VN"/>
+        </w:rPr>
+      </w:pPr>
+    </w:p>
+    <w:p>
+      <w:pPr>
+        <w:rPr>
+          <w:lang w:val="vi-VN"/>
+        </w:rPr>
+      </w:pPr>
+      <w:r>
+        <w:rPr>
+          <w:lang w:val="vi-VN"/>
+        </w:rPr>
+        <w:t>Chọn 1 sản phẩm và thêm vào yêu thích</w:t>
+      </w:r>
+    </w:p>
+    <w:p>
+      <w:pPr>
+        <w:rPr>
+          <w:lang w:val="vi-VN"/>
+        </w:rPr>
+      </w:pPr>
+      <w:r>
+        <w:rPr>
+          <w:lang w:val="vi-VN"/>
+        </w:rPr>
+        <w:drawing>
+          <wp:inline distT="0" distB="0" distL="0" distR="0" wp14:anchorId="68EA659A" wp14:editId="26368F51">
+            <wp:extent cx="5943600" cy="3115310"/>
+            <wp:effectExtent l="0" t="0" r="0" b="8890"/>
+            <wp:docPr id="12" name="Picture 12"/>
+            <wp:cNvGraphicFramePr>
+              <a:graphicFrameLocks xmlns:a="http://schemas.openxmlformats.org/drawingml/2006/main" noChangeAspect="1"/>
+            </wp:cNvGraphicFramePr>
+            <a:graphic xmlns:a="http://schemas.openxmlformats.org/drawingml/2006/main">
+              <a:graphicData uri="http://schemas.openxmlformats.org/drawingml/2006/picture">
+                <pic:pic xmlns:pic="http://schemas.openxmlformats.org/drawingml/2006/picture">
+                  <pic:nvPicPr>
+                    <pic:cNvPr id="1" name=""/>
+                    <pic:cNvPicPr/>
+                  </pic:nvPicPr>
+                  <pic:blipFill>
+                    <a:blip r:embed="rId15"/>
+                    <a:stretch>
+                      <a:fillRect/>
+                    </a:stretch>
+                  </pic:blipFill>
+                  <pic:spPr>
+                    <a:xfrm>
+                      <a:off x="0" y="0"/>
+                      <a:ext cx="5943600" cy="3115310"/>
+                    </a:xfrm>
+                    <a:prstGeom prst="rect">
+                      <a:avLst/>
+                    </a:prstGeom>
+                  </pic:spPr>
+                </pic:pic>
+              </a:graphicData>
+            </a:graphic>
+          </wp:inline>
+        </w:drawing>
+      </w:r>
+    </w:p>
+    <w:p>
+      <w:pPr>
+        <w:rPr>
+          <w:lang w:val="vi-VN"/>
+        </w:rPr>
+      </w:pPr>
+    </w:p>
+    <w:p>
+      <w:pPr>
+        <w:rPr>
+          <w:lang w:val="vi-VN"/>
+        </w:rPr>
+      </w:pPr>
+      <w:r>
+        <w:rPr>
+          <w:lang w:val="vi-VN"/>
+        </w:rPr>
+        <w:t xml:space="preserve">Vào lại trang yêu thích </w:t>
+      </w:r>
+    </w:p>
+    <w:p>
+      <w:pPr>
+        <w:rPr>
+          <w:lang w:val="vi-VN"/>
+        </w:rPr>
+      </w:pPr>
+      <w:r>
+        <w:rPr>
+          <w:lang w:val="vi-VN"/>
+        </w:rPr>
+        <w:lastRenderedPageBreak/>
+        <w:drawing>
+          <wp:inline distT="0" distB="0" distL="0" distR="0" wp14:anchorId="6E3307F3" wp14:editId="6D9ED1D6">
+            <wp:extent cx="5943600" cy="3068955"/>
+            <wp:effectExtent l="0" t="0" r="0" b="0"/>
+            <wp:docPr id="13" name="Picture 13"/>
+            <wp:cNvGraphicFramePr>
+              <a:graphicFrameLocks xmlns:a="http://schemas.openxmlformats.org/drawingml/2006/main" noChangeAspect="1"/>
+            </wp:cNvGraphicFramePr>
+            <a:graphic xmlns:a="http://schemas.openxmlformats.org/drawingml/2006/main">
+              <a:graphicData uri="http://schemas.openxmlformats.org/drawingml/2006/picture">
+                <pic:pic xmlns:pic="http://schemas.openxmlformats.org/drawingml/2006/picture">
+                  <pic:nvPicPr>
+                    <pic:cNvPr id="1" name=""/>
+                    <pic:cNvPicPr/>
+                  </pic:nvPicPr>
+                  <pic:blipFill>
+                    <a:blip r:embed="rId16"/>
+                    <a:stretch>
+                      <a:fillRect/>
+                    </a:stretch>
+                  </pic:blipFill>
+                  <pic:spPr>
+                    <a:xfrm>
+                      <a:off x="0" y="0"/>
+                      <a:ext cx="5943600" cy="3068955"/>
+                    </a:xfrm>
+                    <a:prstGeom prst="rect">
+                      <a:avLst/>
+                    </a:prstGeom>
+                  </pic:spPr>
+                </pic:pic>
+              </a:graphicData>
+            </a:graphic>
+          </wp:inline>
+        </w:drawing>
+      </w:r>
       <w:bookmarkStart w:id="0" w:name="_GoBack"/>
       <w:bookmarkEnd w:id="0"/>
+    </w:p>
+    <w:p>
+      <w:pPr>
+        <w:rPr>
+          <w:lang w:val="vi-VN"/>
+        </w:rPr>
+      </w:pPr>
     </w:p>
     <w:sectPr>
       <w:pgSz w:w="12240" w:h="15840"/>
@@ -935,6 +1598,41 @@
     <w:semiHidden/>
     <w:unhideWhenUsed/>
   </w:style>
+  <w:style w:type="character" w:styleId="Hyperlink">
+    <w:name w:val="Hyperlink"/>
+    <w:basedOn w:val="DefaultParagraphFont"/>
+    <w:uiPriority w:val="99"/>
+    <w:unhideWhenUsed/>
+    <w:rsid w:val="0034763F"/>
+    <w:rPr>
+      <w:color w:val="0563C1" w:themeColor="hyperlink"/>
+      <w:u w:val="single"/>
+    </w:rPr>
+  </w:style>
+  <w:style w:type="character" w:styleId="UnresolvedMention">
+    <w:name w:val="Unresolved Mention"/>
+    <w:basedOn w:val="DefaultParagraphFont"/>
+    <w:uiPriority w:val="99"/>
+    <w:semiHidden/>
+    <w:unhideWhenUsed/>
+    <w:rsid w:val="0034763F"/>
+    <w:rPr>
+      <w:color w:val="605E5C"/>
+      <w:shd w:val="clear" w:color="auto" w:fill="E1DFDD"/>
+    </w:rPr>
+  </w:style>
+  <w:style w:type="character" w:styleId="FollowedHyperlink">
+    <w:name w:val="FollowedHyperlink"/>
+    <w:basedOn w:val="DefaultParagraphFont"/>
+    <w:uiPriority w:val="99"/>
+    <w:semiHidden/>
+    <w:unhideWhenUsed/>
+    <w:rsid w:val="0034763F"/>
+    <w:rPr>
+      <w:color w:val="954F72" w:themeColor="followedHyperlink"/>
+      <w:u w:val="single"/>
+    </w:rPr>
+  </w:style>
 </w:styles>
 </file>
 

</xml_diff>